<commit_message>
lab 3 updated (link added to worksheet
</commit_message>
<xml_diff>
--- a/lab_3/Lab 03 Worksheet.docx
+++ b/lab_3/Lab 03 Worksheet.docx
@@ -12117,6 +12117,38 @@
           <w:szCs w:val="22"/>
         </w:rPr>
       </w:pPr>
+    </w:p>
+    <w:p>
+      <w:pPr>
+        <w:widowControl w:val="0"/>
+        <w:spacing w:line="264" w:lineRule="auto"/>
+        <w:jc w:val="both"/>
+        <w:rPr>
+          <w:rFonts w:eastAsia="Times New Roman" w:cs="Times New Roman"/>
+          <w:color w:val="000000" w:themeColor="text1"/>
+          <w:sz w:val="22"/>
+          <w:szCs w:val="22"/>
+        </w:rPr>
+      </w:pPr>
+      <w:r>
+        <w:rPr>
+          <w:rFonts w:eastAsia="Times New Roman" w:cs="Times New Roman"/>
+          <w:color w:val="000000" w:themeColor="text1"/>
+          <w:sz w:val="22"/>
+          <w:szCs w:val="22"/>
+        </w:rPr>
+        <w:lastRenderedPageBreak/>
+        <w:t xml:space="preserve">Repo github: </w:t>
+      </w:r>
+      <w:r>
+        <w:rPr>
+          <w:rFonts w:eastAsia="Times New Roman" w:cs="Times New Roman"/>
+          <w:color w:val="000000" w:themeColor="text1"/>
+          <w:sz w:val="22"/>
+          <w:szCs w:val="22"/>
+        </w:rPr>
+        <w:t>https://github.com/M-Shees-Abbas/CA-labs.git</w:t>
+      </w:r>
     </w:p>
     <w:sectPr>
       <w:headerReference w:type="default" r:id="rId37"/>
@@ -12240,7 +12272,7 @@
             </wp:anchor>
           </w:drawing>
         </mc:Choice>
-        <mc:Fallback xmlns:oel="http://schemas.microsoft.com/office/2019/extlst" xmlns:w16du="http://schemas.microsoft.com/office/word/2023/wordml/word16du" xmlns:w16sdtfl="http://schemas.microsoft.com/office/word/2024/wordml/sdtformatlock" xmlns:a="http://schemas.openxmlformats.org/drawingml/2006/main">
+        <mc:Fallback xmlns:a="http://schemas.openxmlformats.org/drawingml/2006/main" xmlns:w16sdtfl="http://schemas.microsoft.com/office/word/2024/wordml/sdtformatlock" xmlns:w16du="http://schemas.microsoft.com/office/word/2023/wordml/word16du" xmlns:oel="http://schemas.microsoft.com/office/2019/extlst">
           <w:pict w14:anchorId="41058D53">
             <v:line id="Straight Connector 8" style="position:absolute;z-index:251683328;visibility:visible;mso-wrap-style:square;mso-width-percent:0;mso-wrap-distance-left:9pt;mso-wrap-distance-top:0;mso-wrap-distance-right:9pt;mso-wrap-distance-bottom:0;mso-position-horizontal:absolute;mso-position-horizontal-relative:text;mso-position-vertical:absolute;mso-position-vertical-relative:text;mso-width-percent:0;mso-width-relative:margin" o:spid="_x0000_s1026" strokecolor="#672269" strokeweight="2.25pt" from="0,11.7pt" to="469.75pt,11.7pt" w14:anchorId="21524FB9" o:gfxdata="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">
               <v:stroke joinstyle="miter"/>
@@ -12249,15 +12281,11 @@
         </mc:Fallback>
       </mc:AlternateContent>
     </w:r>
-    <w:r>
-      <w:fldChar w:fldCharType="begin"/>
-    </w:r>
-    <w:r>
-      <w:instrText>STYLEREF "Heading 1" \* MERGEFORMAT</w:instrText>
-    </w:r>
-    <w:r>
-      <w:fldChar w:fldCharType="end"/>
-    </w:r>
+    <w:fldSimple w:instr="STYLEREF &quot;Heading 1&quot; \* MERGEFORMAT">
+      <w:r>
+        <w:t>Points Distribution</w:t>
+      </w:r>
+    </w:fldSimple>
     <w:r>
       <w:rPr>
         <w:rFonts w:ascii="Arial" w:hAnsi="Arial"/>
@@ -12289,11 +12317,21 @@
             <w:pStyle w:val="TOC4"/>
             <w:jc w:val="right"/>
           </w:pPr>
-          <w:fldSimple w:instr="STYLEREF &quot;Heading 2&quot; \* MERGEFORMAT">
-            <w:r>
-              <w:t>Task 4 Provide appropriately commented codes</w:t>
-            </w:r>
-          </w:fldSimple>
+          <w:r>
+            <w:fldChar w:fldCharType="begin"/>
+          </w:r>
+          <w:r>
+            <w:instrText>STYLEREF "Heading 2" \* MERGEFORMAT</w:instrText>
+          </w:r>
+          <w:r>
+            <w:fldChar w:fldCharType="separate"/>
+          </w:r>
+          <w:r>
+            <w:t>Task 4 Provide appropriately commented codes</w:t>
+          </w:r>
+          <w:r>
+            <w:fldChar w:fldCharType="end"/>
+          </w:r>
         </w:p>
       </w:tc>
       <w:tc>
@@ -12391,7 +12429,7 @@
             </wp:anchor>
           </w:drawing>
         </mc:Choice>
-        <mc:Fallback xmlns:oel="http://schemas.microsoft.com/office/2019/extlst" xmlns:w16du="http://schemas.microsoft.com/office/word/2023/wordml/word16du" xmlns:w16sdtfl="http://schemas.microsoft.com/office/word/2024/wordml/sdtformatlock" xmlns:a="http://schemas.openxmlformats.org/drawingml/2006/main">
+        <mc:Fallback xmlns:a="http://schemas.openxmlformats.org/drawingml/2006/main" xmlns:w16sdtfl="http://schemas.microsoft.com/office/word/2024/wordml/sdtformatlock" xmlns:w16du="http://schemas.microsoft.com/office/word/2023/wordml/word16du" xmlns:oel="http://schemas.microsoft.com/office/2019/extlst">
           <w:pict w14:anchorId="58B395BA">
             <v:line id="Straight Connector 6" style="position:absolute;z-index:251681280;visibility:visible;mso-wrap-style:square;mso-width-percent:0;mso-wrap-distance-left:9pt;mso-wrap-distance-top:0;mso-wrap-distance-right:9pt;mso-wrap-distance-bottom:0;mso-position-horizontal:absolute;mso-position-horizontal-relative:text;mso-position-vertical:absolute;mso-position-vertical-relative:text;mso-width-percent:0;mso-width-relative:margin" o:spid="_x0000_s1026" strokecolor="#672269" strokeweight="2.25pt" from="0,11.7pt" to="469.75pt,11.7pt" w14:anchorId="2F639286" o:gfxdata="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">
               <v:stroke joinstyle="miter"/>
@@ -12400,11 +12438,21 @@
         </mc:Fallback>
       </mc:AlternateContent>
     </w:r>
-    <w:fldSimple w:instr="STYLEREF &quot;Heading 1&quot; \* MERGEFORMAT">
-      <w:r>
-        <w:t>Lab 03 – Worksheet</w:t>
-      </w:r>
-    </w:fldSimple>
+    <w:r>
+      <w:fldChar w:fldCharType="begin"/>
+    </w:r>
+    <w:r>
+      <w:instrText>STYLEREF "Heading 1" \* MERGEFORMAT</w:instrText>
+    </w:r>
+    <w:r>
+      <w:fldChar w:fldCharType="separate"/>
+    </w:r>
+    <w:r>
+      <w:t>Lab 03 – Worksheet</w:t>
+    </w:r>
+    <w:r>
+      <w:fldChar w:fldCharType="end"/>
+    </w:r>
     <w:r>
       <w:rPr>
         <w:b/>
@@ -16708,21 +16756,6 @@
 </file>
 
 <file path=customXml/item2.xml><?xml version="1.0" encoding="utf-8"?>
-<p:properties xmlns:p="http://schemas.microsoft.com/office/2006/metadata/properties" xmlns:xsi="http://www.w3.org/2001/XMLSchema-instance" xmlns:pc="http://schemas.microsoft.com/office/infopath/2007/PartnerControls">
-  <documentManagement/>
-</p:properties>
-</file>
-
-<file path=customXml/item3.xml><?xml version="1.0" encoding="utf-8"?>
-<?mso-contentType ?>
-<FormTemplates xmlns="http://schemas.microsoft.com/sharepoint/v3/contenttype/forms">
-  <Display>DocumentLibraryForm</Display>
-  <Edit>DocumentLibraryForm</Edit>
-  <New>DocumentLibraryForm</New>
-</FormTemplates>
-</file>
-
-<file path=customXml/item4.xml><?xml version="1.0" encoding="utf-8"?>
 <ct:contentTypeSchema xmlns:ct="http://schemas.microsoft.com/office/2006/metadata/contentType" xmlns:ma="http://schemas.microsoft.com/office/2006/metadata/properties/metaAttributes" ct:_="" ma:_="" ma:contentTypeName="Document" ma:contentTypeID="0x01010036AA3A4FBD0BD141B280820126FE0C63" ma:contentTypeVersion="6" ma:contentTypeDescription="Create a new document." ma:contentTypeScope="" ma:versionID="5b2aa8fa5903a49408791beca2b83ccb">
   <xsd:schema xmlns:xsd="http://www.w3.org/2001/XMLSchema" xmlns:xs="http://www.w3.org/2001/XMLSchema" xmlns:p="http://schemas.microsoft.com/office/2006/metadata/properties" xmlns:ns2="ee467856-8476-4634-ab3e-f89b7da8812e" xmlns:ns3="7548286f-24e1-46f4-9fd0-eba1e6807dcf" targetNamespace="http://schemas.microsoft.com/office/2006/metadata/properties" ma:root="true" ma:fieldsID="e05aabca32ef8a2499c8a0f77f539357" ns2:_="" ns3:_="">
     <xsd:import namespace="ee467856-8476-4634-ab3e-f89b7da8812e"/>
@@ -16899,6 +16932,21 @@
 </ct:contentTypeSchema>
 </file>
 
+<file path=customXml/item3.xml><?xml version="1.0" encoding="utf-8"?>
+<?mso-contentType ?>
+<FormTemplates xmlns="http://schemas.microsoft.com/sharepoint/v3/contenttype/forms">
+  <Display>DocumentLibraryForm</Display>
+  <Edit>DocumentLibraryForm</Edit>
+  <New>DocumentLibraryForm</New>
+</FormTemplates>
+</file>
+
+<file path=customXml/item4.xml><?xml version="1.0" encoding="utf-8"?>
+<p:properties xmlns:p="http://schemas.microsoft.com/office/2006/metadata/properties" xmlns:xsi="http://www.w3.org/2001/XMLSchema-instance" xmlns:pc="http://schemas.microsoft.com/office/infopath/2007/PartnerControls">
+  <documentManagement/>
+</p:properties>
+</file>
+
 <file path=customXml/itemProps1.xml><?xml version="1.0" encoding="utf-8"?>
 <ds:datastoreItem xmlns:ds="http://schemas.openxmlformats.org/officeDocument/2006/customXml" ds:itemID="{56A64E16-6D30-41D2-964C-A59810B0627A}">
   <ds:schemaRefs>
@@ -16908,23 +16956,6 @@
 </file>
 
 <file path=customXml/itemProps2.xml><?xml version="1.0" encoding="utf-8"?>
-<ds:datastoreItem xmlns:ds="http://schemas.openxmlformats.org/officeDocument/2006/customXml" ds:itemID="{9EB0FCB0-F2B0-4142-B5FC-BBB46365C493}">
-  <ds:schemaRefs>
-    <ds:schemaRef ds:uri="http://schemas.microsoft.com/office/2006/metadata/properties"/>
-    <ds:schemaRef ds:uri="http://schemas.microsoft.com/office/infopath/2007/PartnerControls"/>
-  </ds:schemaRefs>
-</ds:datastoreItem>
-</file>
-
-<file path=customXml/itemProps3.xml><?xml version="1.0" encoding="utf-8"?>
-<ds:datastoreItem xmlns:ds="http://schemas.openxmlformats.org/officeDocument/2006/customXml" ds:itemID="{3F16ED61-B28D-4A52-84F3-EDB6559ABA42}">
-  <ds:schemaRefs>
-    <ds:schemaRef ds:uri="http://schemas.microsoft.com/sharepoint/v3/contenttype/forms"/>
-  </ds:schemaRefs>
-</ds:datastoreItem>
-</file>
-
-<file path=customXml/itemProps4.xml><?xml version="1.0" encoding="utf-8"?>
 <ds:datastoreItem xmlns:ds="http://schemas.openxmlformats.org/officeDocument/2006/customXml" ds:itemID="{8A3B5244-4D48-4043-9E8D-EF201F908121}">
   <ds:schemaRefs>
     <ds:schemaRef ds:uri="http://schemas.microsoft.com/office/2006/metadata/contentType"/>
@@ -16941,4 +16972,21 @@
     <ds:schemaRef ds:uri="http://schemas.microsoft.com/internal/obd"/>
   </ds:schemaRefs>
 </ds:datastoreItem>
+</file>
+
+<file path=customXml/itemProps3.xml><?xml version="1.0" encoding="utf-8"?>
+<ds:datastoreItem xmlns:ds="http://schemas.openxmlformats.org/officeDocument/2006/customXml" ds:itemID="{3F16ED61-B28D-4A52-84F3-EDB6559ABA42}">
+  <ds:schemaRefs>
+    <ds:schemaRef ds:uri="http://schemas.microsoft.com/sharepoint/v3/contenttype/forms"/>
+  </ds:schemaRefs>
+</ds:datastoreItem>
+</file>
+
+<file path=customXml/itemProps4.xml><?xml version="1.0" encoding="utf-8"?>
+<ds:datastoreItem xmlns:ds="http://schemas.openxmlformats.org/officeDocument/2006/customXml" ds:itemID="{9EB0FCB0-F2B0-4142-B5FC-BBB46365C493}">
+  <ds:schemaRefs>
+    <ds:schemaRef ds:uri="http://schemas.microsoft.com/office/2006/metadata/properties"/>
+    <ds:schemaRef ds:uri="http://schemas.microsoft.com/office/infopath/2007/PartnerControls"/>
+  </ds:schemaRefs>
+</ds:datastoreItem>
 </file>
</xml_diff>

<commit_message>
git hub updated (link updated in the worksheet)
</commit_message>
<xml_diff>
--- a/lab_3/Lab 03 Worksheet.docx
+++ b/lab_3/Lab 03 Worksheet.docx
@@ -12281,11 +12281,15 @@
         </mc:Fallback>
       </mc:AlternateContent>
     </w:r>
-    <w:fldSimple w:instr="STYLEREF &quot;Heading 1&quot; \* MERGEFORMAT">
-      <w:r>
-        <w:t>Points Distribution</w:t>
-      </w:r>
-    </w:fldSimple>
+    <w:r>
+      <w:fldChar w:fldCharType="begin"/>
+    </w:r>
+    <w:r>
+      <w:instrText>STYLEREF "Heading 1" \* MERGEFORMAT</w:instrText>
+    </w:r>
+    <w:r>
+      <w:fldChar w:fldCharType="end"/>
+    </w:r>
     <w:r>
       <w:rPr>
         <w:rFonts w:ascii="Arial" w:hAnsi="Arial"/>

</xml_diff>